<commit_message>
Twee opties per knelpunt; kalender met A en B; toetsingsblad per centrum
Co-Authored-By: Claude Opus 5.5 <noreply@anthropic.com>
</commit_message>
<xml_diff>
--- a/PARADISE_kalender_opleiding.docx
+++ b/PARADISE_kalender_opleiding.docx
@@ -44,7 +44,7 @@
           <w:color w:val="5A6A78"/>
           <w:sz w:val="17"/>
         </w:rPr>
-        <w:t>November 2026 tot maart 2027, volgens de opleidingsplanning na de controle van 28 september 2026. VM = voormiddag, NM = namiddag. Opties en data met “te bevestigen” liggen nog niet vast.</w:t>
+        <w:t>November 2026 tot maart 2027, volgens de opleidingsplanning na de controle van 28 september 2026. VM = voormiddag, NM = namiddag. Waar het niet voor iedereen lukt, staan twee opties (A en B); die worden getoetst bij de centra tegen vr 16 okt.</w:t>
       </w:r>
     </w:p>
     <w:tbl>
@@ -712,6 +712,7 @@
         <w:tc>
           <w:tcPr>
             <w:tcW w:type="dxa" w:w="2835"/>
+            <w:shd w:val="clear" w:color="auto" w:fill="E3ECF5"/>
           </w:tcPr>
           <w:p>
             <w:pPr>
@@ -726,6 +727,41 @@
                 <w:sz w:val="15"/>
               </w:rPr>
               <w:t>12</w:t>
+            </w:r>
+          </w:p>
+          <w:p>
+            <w:pPr>
+              <w:spacing w:before="20" w:after="20"/>
+            </w:pPr>
+            <w:r>
+              <w:rPr>
+                <w:rFonts w:ascii="Segoe UI" w:hAnsi="Segoe UI"/>
+                <w:b/>
+                <w:i w:val="0"/>
+                <w:color w:val="00407A"/>
+                <w:sz w:val="15"/>
+              </w:rPr>
+              <w:t xml:space="preserve">8u30–10u  </w:t>
+            </w:r>
+            <w:r>
+              <w:rPr>
+                <w:rFonts w:ascii="Segoe UI" w:hAnsi="Segoe UI"/>
+                <w:b/>
+                <w:i w:val="0"/>
+                <w:color w:val="00407A"/>
+                <w:sz w:val="15"/>
+              </w:rPr>
+              <w:t>Herhaling theorie 1 (optie B)</w:t>
+            </w:r>
+            <w:r>
+              <w:rPr>
+                <w:rFonts w:ascii="Segoe UI" w:hAnsi="Segoe UI"/>
+                <w:b w:val="0"/>
+                <w:i w:val="0"/>
+                <w:color w:val="1B2630"/>
+                <w:sz w:val="15"/>
+              </w:rPr>
+              <w:t xml:space="preserve"> · online</w:t>
             </w:r>
           </w:p>
         </w:tc>
@@ -873,6 +909,7 @@
         <w:tc>
           <w:tcPr>
             <w:tcW w:type="dxa" w:w="2835"/>
+            <w:shd w:val="clear" w:color="auto" w:fill="E3ECF5"/>
           </w:tcPr>
           <w:p>
             <w:pPr>
@@ -887,6 +924,41 @@
                 <w:sz w:val="15"/>
               </w:rPr>
               <w:t>19</w:t>
+            </w:r>
+          </w:p>
+          <w:p>
+            <w:pPr>
+              <w:spacing w:before="20" w:after="20"/>
+            </w:pPr>
+            <w:r>
+              <w:rPr>
+                <w:rFonts w:ascii="Segoe UI" w:hAnsi="Segoe UI"/>
+                <w:b/>
+                <w:i w:val="0"/>
+                <w:color w:val="00407A"/>
+                <w:sz w:val="15"/>
+              </w:rPr>
+              <w:t xml:space="preserve">8u30–10u  </w:t>
+            </w:r>
+            <w:r>
+              <w:rPr>
+                <w:rFonts w:ascii="Segoe UI" w:hAnsi="Segoe UI"/>
+                <w:b/>
+                <w:i w:val="0"/>
+                <w:color w:val="00407A"/>
+                <w:sz w:val="15"/>
+              </w:rPr>
+              <w:t>Herhaling theorie 2 (optie B)</w:t>
+            </w:r>
+            <w:r>
+              <w:rPr>
+                <w:rFonts w:ascii="Segoe UI" w:hAnsi="Segoe UI"/>
+                <w:b w:val="0"/>
+                <w:i w:val="0"/>
+                <w:color w:val="1B2630"/>
+                <w:sz w:val="15"/>
+              </w:rPr>
+              <w:t xml:space="preserve"> · online</w:t>
             </w:r>
           </w:p>
         </w:tc>
@@ -1034,6 +1106,7 @@
         <w:tc>
           <w:tcPr>
             <w:tcW w:type="dxa" w:w="2835"/>
+            <w:shd w:val="clear" w:color="auto" w:fill="E3ECF5"/>
           </w:tcPr>
           <w:p>
             <w:pPr>
@@ -1048,6 +1121,41 @@
                 <w:sz w:val="15"/>
               </w:rPr>
               <w:t>26</w:t>
+            </w:r>
+          </w:p>
+          <w:p>
+            <w:pPr>
+              <w:spacing w:before="20" w:after="20"/>
+            </w:pPr>
+            <w:r>
+              <w:rPr>
+                <w:rFonts w:ascii="Segoe UI" w:hAnsi="Segoe UI"/>
+                <w:b/>
+                <w:i w:val="0"/>
+                <w:color w:val="00407A"/>
+                <w:sz w:val="15"/>
+              </w:rPr>
+              <w:t xml:space="preserve">8u30–10u  </w:t>
+            </w:r>
+            <w:r>
+              <w:rPr>
+                <w:rFonts w:ascii="Segoe UI" w:hAnsi="Segoe UI"/>
+                <w:b/>
+                <w:i w:val="0"/>
+                <w:color w:val="00407A"/>
+                <w:sz w:val="15"/>
+              </w:rPr>
+              <w:t>Herhaling toestemming (optie B)</w:t>
+            </w:r>
+            <w:r>
+              <w:rPr>
+                <w:rFonts w:ascii="Segoe UI" w:hAnsi="Segoe UI"/>
+                <w:b w:val="0"/>
+                <w:i w:val="0"/>
+                <w:color w:val="1B2630"/>
+                <w:sz w:val="15"/>
+              </w:rPr>
+              <w:t xml:space="preserve"> · online</w:t>
             </w:r>
           </w:p>
         </w:tc>
@@ -1099,6 +1207,7 @@
         <w:tc>
           <w:tcPr>
             <w:tcW w:type="dxa" w:w="2835"/>
+            <w:shd w:val="clear" w:color="auto" w:fill="DDF1F8"/>
           </w:tcPr>
           <w:p>
             <w:pPr>
@@ -1113,6 +1222,76 @@
                 <w:sz w:val="15"/>
               </w:rPr>
               <w:t>30</w:t>
+            </w:r>
+          </w:p>
+          <w:p>
+            <w:pPr>
+              <w:spacing w:before="20" w:after="20"/>
+            </w:pPr>
+            <w:r>
+              <w:rPr>
+                <w:rFonts w:ascii="Segoe UI" w:hAnsi="Segoe UI"/>
+                <w:b/>
+                <w:i w:val="0"/>
+                <w:color w:val="00407A"/>
+                <w:sz w:val="15"/>
+              </w:rPr>
+              <w:t xml:space="preserve">VM  </w:t>
+            </w:r>
+            <w:r>
+              <w:rPr>
+                <w:rFonts w:ascii="Segoe UI" w:hAnsi="Segoe UI"/>
+                <w:b/>
+                <w:i w:val="0"/>
+                <w:color w:val="00407A"/>
+                <w:sz w:val="15"/>
+              </w:rPr>
+              <w:t>Technologie (optie B)</w:t>
+            </w:r>
+            <w:r>
+              <w:rPr>
+                <w:rFonts w:ascii="Segoe UI" w:hAnsi="Segoe UI"/>
+                <w:b w:val="0"/>
+                <w:i w:val="0"/>
+                <w:color w:val="1B2630"/>
+                <w:sz w:val="15"/>
+              </w:rPr>
+              <w:t xml:space="preserve"> · AZ Sint-Jan Brugge</w:t>
+            </w:r>
+          </w:p>
+          <w:p>
+            <w:pPr>
+              <w:spacing w:before="20" w:after="20"/>
+            </w:pPr>
+            <w:r>
+              <w:rPr>
+                <w:rFonts w:ascii="Segoe UI" w:hAnsi="Segoe UI"/>
+                <w:b/>
+                <w:i w:val="0"/>
+                <w:color w:val="00407A"/>
+                <w:sz w:val="15"/>
+              </w:rPr>
+              <w:t xml:space="preserve">NM  </w:t>
+            </w:r>
+            <w:r>
+              <w:rPr>
+                <w:rFonts w:ascii="Segoe UI" w:hAnsi="Segoe UI"/>
+                <w:b/>
+                <w:i w:val="0"/>
+                <w:color w:val="00407A"/>
+                <w:sz w:val="15"/>
+              </w:rPr>
+              <w:t>Technologie (optie B)</w:t>
+            </w:r>
+            <w:r>
+              <w:rPr>
+                <w:rFonts w:ascii="Segoe UI" w:hAnsi="Segoe UI"/>
+                <w:b w:val="0"/>
+                <w:i w:val="0"/>
+                <w:color w:val="1B2630"/>
+                <w:sz w:val="15"/>
+              </w:rPr>
+              <w:t xml:space="preserve"> · AZ Groeninge Kortrijk</w:t>
             </w:r>
           </w:p>
         </w:tc>
@@ -1158,6 +1337,11 @@
         </w:tc>
       </w:tr>
     </w:tbl>
+    <w:p>
+      <w:r>
+        <w:br w:type="page"/>
+      </w:r>
+    </w:p>
     <w:p>
       <w:pPr>
         <w:keepNext/>
@@ -1432,7 +1616,7 @@
                 <w:color w:val="00407A"/>
                 <w:sz w:val="15"/>
               </w:rPr>
-              <w:t>Technologie</w:t>
+              <w:t>Technologie (optie A)</w:t>
             </w:r>
             <w:r>
               <w:rPr>
@@ -1467,7 +1651,7 @@
                 <w:color w:val="00407A"/>
                 <w:sz w:val="15"/>
               </w:rPr>
-              <w:t>Technologie</w:t>
+              <w:t>Technologie (optie A)</w:t>
             </w:r>
             <w:r>
               <w:rPr>
@@ -2784,7 +2968,7 @@
                 <w:color w:val="A34A00"/>
                 <w:sz w:val="15"/>
               </w:rPr>
-              <w:t>SEBIA 1–2, groep West (optie)</w:t>
+              <w:t>SEBIA 1–2, groep West (optie A)</w:t>
             </w:r>
             <w:r>
               <w:rPr>
@@ -2855,7 +3039,7 @@
                 <w:color w:val="A34A00"/>
                 <w:sz w:val="15"/>
               </w:rPr>
-              <w:t>SEBIA 1–2, groep West (optie)</w:t>
+              <w:t>SEBIA 1–2, groep West (optie B)</w:t>
             </w:r>
             <w:r>
               <w:rPr>
@@ -3037,7 +3221,7 @@
                 <w:color w:val="1E5B3A"/>
                 <w:sz w:val="15"/>
               </w:rPr>
-              <w:t>Droogloop</w:t>
+              <w:t>Droogloop (optie A)</w:t>
             </w:r>
             <w:r>
               <w:rPr>
@@ -3110,6 +3294,7 @@
         <w:tc>
           <w:tcPr>
             <w:tcW w:type="dxa" w:w="2835"/>
+            <w:shd w:val="clear" w:color="auto" w:fill="E3ECF5"/>
           </w:tcPr>
           <w:p>
             <w:pPr>
@@ -3124,6 +3309,41 @@
                 <w:sz w:val="15"/>
               </w:rPr>
               <w:t>15</w:t>
+            </w:r>
+          </w:p>
+          <w:p>
+            <w:pPr>
+              <w:spacing w:before="20" w:after="20"/>
+            </w:pPr>
+            <w:r>
+              <w:rPr>
+                <w:rFonts w:ascii="Segoe UI" w:hAnsi="Segoe UI"/>
+                <w:b/>
+                <w:i w:val="0"/>
+                <w:color w:val="00407A"/>
+                <w:sz w:val="15"/>
+              </w:rPr>
+              <w:t xml:space="preserve">13u–15u  </w:t>
+            </w:r>
+            <w:r>
+              <w:rPr>
+                <w:rFonts w:ascii="Segoe UI" w:hAnsi="Segoe UI"/>
+                <w:b/>
+                <w:i w:val="0"/>
+                <w:color w:val="00407A"/>
+                <w:sz w:val="15"/>
+              </w:rPr>
+              <w:t>Herhaling datacollectie (optie B)</w:t>
+            </w:r>
+            <w:r>
+              <w:rPr>
+                <w:rFonts w:ascii="Segoe UI" w:hAnsi="Segoe UI"/>
+                <w:b w:val="0"/>
+                <w:i w:val="0"/>
+                <w:color w:val="1B2630"/>
+                <w:sz w:val="15"/>
+              </w:rPr>
+              <w:t xml:space="preserve"> · online, voor Gent</w:t>
             </w:r>
           </w:p>
         </w:tc>
@@ -3155,6 +3375,7 @@
         <w:tc>
           <w:tcPr>
             <w:tcW w:type="dxa" w:w="2835"/>
+            <w:shd w:val="clear" w:color="auto" w:fill="E6F0E9"/>
           </w:tcPr>
           <w:p>
             <w:pPr>
@@ -3169,6 +3390,41 @@
                 <w:sz w:val="15"/>
               </w:rPr>
               <w:t>18</w:t>
+            </w:r>
+          </w:p>
+          <w:p>
+            <w:pPr>
+              <w:spacing w:before="20" w:after="20"/>
+            </w:pPr>
+            <w:r>
+              <w:rPr>
+                <w:rFonts w:ascii="Segoe UI" w:hAnsi="Segoe UI"/>
+                <w:b/>
+                <w:i w:val="0"/>
+                <w:color w:val="1E5B3A"/>
+                <w:sz w:val="15"/>
+              </w:rPr>
+              <w:t xml:space="preserve">VM  </w:t>
+            </w:r>
+            <w:r>
+              <w:rPr>
+                <w:rFonts w:ascii="Segoe UI" w:hAnsi="Segoe UI"/>
+                <w:b/>
+                <w:i w:val="0"/>
+                <w:color w:val="1E5B3A"/>
+                <w:sz w:val="15"/>
+              </w:rPr>
+              <w:t>Droogloop (optie B)</w:t>
+            </w:r>
+            <w:r>
+              <w:rPr>
+                <w:rFonts w:ascii="Segoe UI" w:hAnsi="Segoe UI"/>
+                <w:b w:val="0"/>
+                <w:i w:val="0"/>
+                <w:color w:val="1B2630"/>
+                <w:sz w:val="15"/>
+              </w:rPr>
+              <w:t xml:space="preserve"> · AZ Sint-Jan Brugge</w:t>
             </w:r>
           </w:p>
         </w:tc>
@@ -4821,7 +5077,7 @@
                 <w:color w:val="A34A00"/>
                 <w:sz w:val="15"/>
               </w:rPr>
-              <w:t>SEBIA 3–4, groep Oost (te bevestigen)</w:t>
+              <w:t>SEBIA 3–4, groep Oost (optie A)</w:t>
             </w:r>
             <w:r>
               <w:rPr>
@@ -4887,7 +5143,7 @@
                 <w:color w:val="A34A00"/>
                 <w:sz w:val="15"/>
               </w:rPr>
-              <w:t xml:space="preserve">avond  </w:t>
+              <w:t xml:space="preserve">17u30–21u30  </w:t>
             </w:r>
             <w:r>
               <w:rPr>
@@ -4897,7 +5153,7 @@
                 <w:color w:val="A34A00"/>
                 <w:sz w:val="15"/>
               </w:rPr>
-              <w:t>SEBIA 3–4, groep West (optie)</w:t>
+              <w:t>SEBIA 3–4, groep West (optie A)</w:t>
             </w:r>
             <w:r>
               <w:rPr>
@@ -4953,7 +5209,7 @@
                 <w:color w:val="A34A00"/>
                 <w:sz w:val="15"/>
               </w:rPr>
-              <w:t>SEBIA 3–4, groep West (optie)</w:t>
+              <w:t>SEBIA 3–4, groep West (optie B)</w:t>
             </w:r>
             <w:r>
               <w:rPr>
@@ -5015,6 +5271,7 @@
         <w:tc>
           <w:tcPr>
             <w:tcW w:type="dxa" w:w="2835"/>
+            <w:shd w:val="clear" w:color="auto" w:fill="FFE9D6"/>
           </w:tcPr>
           <w:p>
             <w:pPr>
@@ -5029,6 +5286,41 @@
                 <w:sz w:val="15"/>
               </w:rPr>
               <w:t>9</w:t>
+            </w:r>
+          </w:p>
+          <w:p>
+            <w:pPr>
+              <w:spacing w:before="20" w:after="20"/>
+            </w:pPr>
+            <w:r>
+              <w:rPr>
+                <w:rFonts w:ascii="Segoe UI" w:hAnsi="Segoe UI"/>
+                <w:b/>
+                <w:i w:val="0"/>
+                <w:color w:val="A34A00"/>
+                <w:sz w:val="15"/>
+              </w:rPr>
+              <w:t xml:space="preserve">9u–13u  </w:t>
+            </w:r>
+            <w:r>
+              <w:rPr>
+                <w:rFonts w:ascii="Segoe UI" w:hAnsi="Segoe UI"/>
+                <w:b/>
+                <w:i w:val="0"/>
+                <w:color w:val="A34A00"/>
+                <w:sz w:val="15"/>
+              </w:rPr>
+              <w:t>SEBIA 3–4, groep Oost (optie B)</w:t>
+            </w:r>
+            <w:r>
+              <w:rPr>
+                <w:rFonts w:ascii="Segoe UI" w:hAnsi="Segoe UI"/>
+                <w:b w:val="0"/>
+                <w:i w:val="0"/>
+                <w:color w:val="1B2630"/>
+                <w:sz w:val="15"/>
+              </w:rPr>
+              <w:t xml:space="preserve"> · centraal, voorstel Leuven</w:t>
             </w:r>
           </w:p>
         </w:tc>
@@ -5504,7 +5796,7 @@
           <w:color w:val="1B2630"/>
           <w:sz w:val="17"/>
         </w:rPr>
-        <w:t>SEBIA 5, 1,5 u per podoloog in het eigen centrum, in maart–april en vóór de eerste maand 3-visite (beste moment: Kortrijk wo, Brugge ma VM, Gent do VM, Leuven di, Antwerpen di of wo VM, Aalst di). SEBIA 6, intervisie, 1 u per podoloog, online, op maand 6–9 na de start van de inclusies.</w:t>
+        <w:t>SEBIA 5, 1,5 u per podoloog in het eigen centrum, in maart vóór de paasvakantie (A) of vanaf 12 april (B), vóór de eerste maand 3-visite (beste moment: Kortrijk wo, Brugge ma VM, Gent do VM, Leuven di, Antwerpen di of wo VM, Aalst di). SEBIA 6, intervisie, 1 u per podoloog, online, op maand 6–9 na de start van de inclusies.</w:t>
       </w:r>
     </w:p>
     <w:p>
@@ -5787,7 +6079,7 @@
                 <w:color w:val="1B2630"/>
                 <w:sz w:val="16"/>
               </w:rPr>
-              <w:t>wo 2 dec, VM</w:t>
+              <w:t>A: wo 2 dec VM · B: ma 30 nov NM</w:t>
             </w:r>
           </w:p>
         </w:tc>
@@ -5807,7 +6099,7 @@
                 <w:color w:val="1B2630"/>
                 <w:sz w:val="16"/>
               </w:rPr>
-              <w:t>West: do 7 jan avond of vr 8 jan NM</w:t>
+              <w:t>West · A: do 7 jan avond · B: vr 8 jan NM</w:t>
             </w:r>
           </w:p>
         </w:tc>
@@ -5867,7 +6159,7 @@
                 <w:color w:val="1B2630"/>
                 <w:sz w:val="16"/>
               </w:rPr>
-              <w:t>West: do 4 mrt avond of vr 5 mrt NM</w:t>
+              <w:t>West · A: do 4 mrt avond · B: vr 5 mrt NM</w:t>
             </w:r>
           </w:p>
         </w:tc>
@@ -5952,7 +6244,7 @@
                 <w:color w:val="1B2630"/>
                 <w:sz w:val="16"/>
               </w:rPr>
-              <w:t>wo 2 dec, NM</w:t>
+              <w:t>A: wo 2 dec NM · B: ma 30 nov VM</w:t>
             </w:r>
           </w:p>
         </w:tc>
@@ -5972,7 +6264,7 @@
                 <w:color w:val="1B2630"/>
                 <w:sz w:val="16"/>
               </w:rPr>
-              <w:t>West: do 7 jan avond of vr 8 jan NM</w:t>
+              <w:t>West · A: do 7 jan avond · B: vr 8 jan NM</w:t>
             </w:r>
           </w:p>
         </w:tc>
@@ -5992,7 +6284,7 @@
                 <w:color w:val="1B2630"/>
                 <w:sz w:val="16"/>
               </w:rPr>
-              <w:t>wo 13 jan, NM</w:t>
+              <w:t>A: wo 13 jan NM · B: ma 18 jan VM</w:t>
             </w:r>
           </w:p>
         </w:tc>
@@ -6012,7 +6304,7 @@
                 <w:color w:val="1B2630"/>
                 <w:sz w:val="16"/>
               </w:rPr>
-              <w:t>geen woensdag vrij</w:t>
+              <w:t>de niet gekozen droogloopdatum</w:t>
             </w:r>
           </w:p>
         </w:tc>
@@ -6032,7 +6324,7 @@
                 <w:color w:val="1B2630"/>
                 <w:sz w:val="16"/>
               </w:rPr>
-              <w:t>West: do 4 mrt avond of vr 5 mrt NM</w:t>
+              <w:t>West · A: do 4 mrt avond · B: vr 5 mrt NM</w:t>
             </w:r>
           </w:p>
         </w:tc>
@@ -6137,7 +6429,7 @@
                 <w:color w:val="1B2630"/>
                 <w:sz w:val="16"/>
               </w:rPr>
-              <w:t>West: do 7 jan avond of vr 8 jan NM</w:t>
+              <w:t>West · A: do 7 jan avond · B: vr 8 jan NM</w:t>
             </w:r>
           </w:p>
         </w:tc>
@@ -6197,7 +6489,7 @@
                 <w:color w:val="1B2630"/>
                 <w:sz w:val="16"/>
               </w:rPr>
-              <w:t>West: do 4 mrt avond of vr 5 mrt NM</w:t>
+              <w:t>West · A: do 4 mrt avond · B: vr 5 mrt NM</w:t>
             </w:r>
           </w:p>
         </w:tc>
@@ -6362,7 +6654,7 @@
                 <w:color w:val="1B2630"/>
                 <w:sz w:val="16"/>
               </w:rPr>
-              <w:t>Oost: di 2 mrt, 9u–13u</w:t>
+              <w:t>Oost · A: di 2 mrt · B: di 9 mrt</w:t>
             </w:r>
           </w:p>
         </w:tc>
@@ -6527,7 +6819,7 @@
                 <w:color w:val="1B2630"/>
                 <w:sz w:val="16"/>
               </w:rPr>
-              <w:t>Oost: di 2 mrt, 9u–13u</w:t>
+              <w:t>Oost · A: di 2 mrt · B: di 9 mrt</w:t>
             </w:r>
           </w:p>
         </w:tc>
@@ -6692,7 +6984,7 @@
                 <w:color w:val="1B2630"/>
                 <w:sz w:val="16"/>
               </w:rPr>
-              <w:t>Oost: di 2 mrt, 9u–13u</w:t>
+              <w:t>Oost · A: di 2 mrt · B: di 9 mrt</w:t>
             </w:r>
           </w:p>
         </w:tc>
@@ -6782,7 +7074,7 @@
           <w:color w:val="1B2630"/>
           <w:sz w:val="17"/>
         </w:rPr>
-        <w:t>Groep West: avond of vrijdagnamiddag, via een doodle met de podologen en Dobbels.</w:t>
+        <w:t>Waar het niet voor iedereen lukt, zijn er twee opties (A en B): planning, sectie 9. Toetsing bij de centra tegen vr 16 okt.</w:t>
       </w:r>
     </w:p>
     <w:p>
@@ -6808,7 +7100,7 @@
           <w:color w:val="1B2630"/>
           <w:sz w:val="17"/>
         </w:rPr>
-        <w:t>SEBIA 3–4: data nog te bevestigen door Dobbels.</w:t>
+        <w:t>Online sessies: A = opname voor wie niet kan · B = live herhaling op do 12, 19 en 26 nov, 8u30–10u.</w:t>
       </w:r>
     </w:p>
     <w:p>
@@ -6834,7 +7126,7 @@
           <w:color w:val="1B2630"/>
           <w:sz w:val="17"/>
         </w:rPr>
-        <w:t>Online sessies op dinsdag: Gent kan nooit, Kortrijk heeft dan voetkliniek. Voorstel: opnemen.</w:t>
+        <w:t>Datacollectie: A = opname · B = herhaling vr 15 jan, 13u–15u, voor Gent.</w:t>
       </w:r>
     </w:p>
     <w:p>
@@ -6860,7 +7152,7 @@
           <w:color w:val="1B2630"/>
           <w:sz w:val="17"/>
         </w:rPr>
-        <w:t>Locaties van de centrale sessies: voorstel Leuven (Oost) en Gent (West).</w:t>
+        <w:t>SEBIA 1–4: data nog te bevestigen door Dobbels. Locaties: voorstel Leuven (Oost) en Gent (West).</w:t>
       </w:r>
     </w:p>
     <w:sectPr>

</xml_diff>

<commit_message>
Opleidingsplanning opnieuw opgemaakt volgens alle beslissingen; eCRF 40 in REDCap
Planning, kalender en toetsingsblad: theorie volgt de vier blokken van het opleidingsdeck, gezondheidseconomie en procesevaluatie als online theorie, artsen alleen theorie, pedorthisten een keer, Dobbels geeft SEBIA 5 in de centra, Janou geeft datacollectie; alle data getoetst aan de beschikbaarheid, Antwerpen alleen in even weken. REDCap: formulier e40_dagboek_therapeut op het nieuwe herhalende event Dagboek therapeut (Optimal Care), met bijgewerkte gidsen.

Co-Authored-By: Claude Opus 5.5 <noreply@anthropic.com>
</commit_message>
<xml_diff>
--- a/PARADISE_kalender_opleiding.docx
+++ b/PARADISE_kalender_opleiding.docx
@@ -44,7 +44,7 @@
           <w:color w:val="5A6A78"/>
           <w:sz w:val="17"/>
         </w:rPr>
-        <w:t>November 2026 tot maart 2027, volgens de opleidingsplanning na de controle van 28 september 2026. VM = voormiddag, NM = namiddag. Waar het niet voor iedereen lukt, staan twee opties (A en B); die worden getoetst bij de centra tegen vr 16 okt.</w:t>
+        <w:t>November 2026 tot maart 2027, volgens de opleidingsplanning van 29 september 2026. VM = voormiddag, NM = namiddag. Waar het niet voor iedereen lukt, staan twee opties (A en B); die worden getoetst bij de centra tegen vr 16 okt. Artsen volgen alleen de theorie; technologie en droogloop zijn voor de podologen.</w:t>
       </w:r>
     </w:p>
     <w:tbl>
@@ -664,7 +664,7 @@
                 <w:color w:val="00407A"/>
                 <w:sz w:val="15"/>
               </w:rPr>
-              <w:t>Theorie 1</w:t>
+              <w:t>Theorie 1 · waarom en de meting</w:t>
             </w:r>
             <w:r>
               <w:rPr>
@@ -674,7 +674,7 @@
                 <w:color w:val="1B2630"/>
                 <w:sz w:val="15"/>
               </w:rPr>
-              <w:t xml:space="preserve"> · online · iedereen</w:t>
+              <w:t xml:space="preserve"> · online · podologen en artsen</w:t>
             </w:r>
           </w:p>
         </w:tc>
@@ -833,7 +833,6 @@
         <w:tc>
           <w:tcPr>
             <w:tcW w:type="dxa" w:w="2835"/>
-            <w:shd w:val="clear" w:color="auto" w:fill="E3ECF5"/>
           </w:tcPr>
           <w:p>
             <w:pPr>
@@ -848,41 +847,6 @@
                 <w:sz w:val="15"/>
               </w:rPr>
               <w:t>17</w:t>
-            </w:r>
-          </w:p>
-          <w:p>
-            <w:pPr>
-              <w:spacing w:before="20" w:after="20"/>
-            </w:pPr>
-            <w:r>
-              <w:rPr>
-                <w:rFonts w:ascii="Segoe UI" w:hAnsi="Segoe UI"/>
-                <w:b/>
-                <w:i w:val="0"/>
-                <w:color w:val="00407A"/>
-                <w:sz w:val="15"/>
-              </w:rPr>
-              <w:t xml:space="preserve">12u30–14u  </w:t>
-            </w:r>
-            <w:r>
-              <w:rPr>
-                <w:rFonts w:ascii="Segoe UI" w:hAnsi="Segoe UI"/>
-                <w:b/>
-                <w:i w:val="0"/>
-                <w:color w:val="00407A"/>
-                <w:sz w:val="15"/>
-              </w:rPr>
-              <w:t>Theorie 2</w:t>
-            </w:r>
-            <w:r>
-              <w:rPr>
-                <w:rFonts w:ascii="Segoe UI" w:hAnsi="Segoe UI"/>
-                <w:b w:val="0"/>
-                <w:i w:val="0"/>
-                <w:color w:val="1B2630"/>
-                <w:sz w:val="15"/>
-              </w:rPr>
-              <w:t xml:space="preserve"> · online · iedereen</w:t>
             </w:r>
           </w:p>
         </w:tc>
@@ -909,7 +873,6 @@
         <w:tc>
           <w:tcPr>
             <w:tcW w:type="dxa" w:w="2835"/>
-            <w:shd w:val="clear" w:color="auto" w:fill="E3ECF5"/>
           </w:tcPr>
           <w:p>
             <w:pPr>
@@ -924,41 +887,6 @@
                 <w:sz w:val="15"/>
               </w:rPr>
               <w:t>19</w:t>
-            </w:r>
-          </w:p>
-          <w:p>
-            <w:pPr>
-              <w:spacing w:before="20" w:after="20"/>
-            </w:pPr>
-            <w:r>
-              <w:rPr>
-                <w:rFonts w:ascii="Segoe UI" w:hAnsi="Segoe UI"/>
-                <w:b/>
-                <w:i w:val="0"/>
-                <w:color w:val="00407A"/>
-                <w:sz w:val="15"/>
-              </w:rPr>
-              <w:t xml:space="preserve">8u30–10u  </w:t>
-            </w:r>
-            <w:r>
-              <w:rPr>
-                <w:rFonts w:ascii="Segoe UI" w:hAnsi="Segoe UI"/>
-                <w:b/>
-                <w:i w:val="0"/>
-                <w:color w:val="00407A"/>
-                <w:sz w:val="15"/>
-              </w:rPr>
-              <w:t>Herhaling theorie 2 (optie B)</w:t>
-            </w:r>
-            <w:r>
-              <w:rPr>
-                <w:rFonts w:ascii="Segoe UI" w:hAnsi="Segoe UI"/>
-                <w:b w:val="0"/>
-                <w:i w:val="0"/>
-                <w:color w:val="1B2630"/>
-                <w:sz w:val="15"/>
-              </w:rPr>
-              <w:t xml:space="preserve"> · online</w:t>
             </w:r>
           </w:p>
         </w:tc>
@@ -1069,7 +997,7 @@
                 <w:color w:val="00407A"/>
                 <w:sz w:val="15"/>
               </w:rPr>
-              <w:t>Toestemming en randomisatie</w:t>
+              <w:t>Theorie 2 · het traject, toestellen en regels</w:t>
             </w:r>
             <w:r>
               <w:rPr>
@@ -1079,7 +1007,7 @@
                 <w:color w:val="1B2630"/>
                 <w:sz w:val="15"/>
               </w:rPr>
-              <w:t xml:space="preserve"> · online · site-PI's en wie toestemming afneemt</w:t>
+              <w:t xml:space="preserve"> · online · podologen en artsen</w:t>
             </w:r>
           </w:p>
         </w:tc>
@@ -1145,7 +1073,7 @@
                 <w:color w:val="00407A"/>
                 <w:sz w:val="15"/>
               </w:rPr>
-              <w:t>Herhaling toestemming (optie B)</w:t>
+              <w:t>Herhaling theorie 2 (optie B)</w:t>
             </w:r>
             <w:r>
               <w:rPr>
@@ -1753,6 +1681,7 @@
         <w:tc>
           <w:tcPr>
             <w:tcW w:type="dxa" w:w="2835"/>
+            <w:shd w:val="clear" w:color="auto" w:fill="E3ECF5"/>
           </w:tcPr>
           <w:p>
             <w:pPr>
@@ -1769,10 +1698,46 @@
               <w:t>8</w:t>
             </w:r>
           </w:p>
+          <w:p>
+            <w:pPr>
+              <w:spacing w:before="20" w:after="20"/>
+            </w:pPr>
+            <w:r>
+              <w:rPr>
+                <w:rFonts w:ascii="Segoe UI" w:hAnsi="Segoe UI"/>
+                <w:b/>
+                <w:i w:val="0"/>
+                <w:color w:val="00407A"/>
+                <w:sz w:val="15"/>
+              </w:rPr>
+              <w:t xml:space="preserve">12u30–14u  </w:t>
+            </w:r>
+            <w:r>
+              <w:rPr>
+                <w:rFonts w:ascii="Segoe UI" w:hAnsi="Segoe UI"/>
+                <w:b/>
+                <w:i w:val="0"/>
+                <w:color w:val="00407A"/>
+                <w:sz w:val="15"/>
+              </w:rPr>
+              <w:t>Gezondheidseconomie en procesevaluatie</w:t>
+            </w:r>
+            <w:r>
+              <w:rPr>
+                <w:rFonts w:ascii="Segoe UI" w:hAnsi="Segoe UI"/>
+                <w:b w:val="0"/>
+                <w:i w:val="0"/>
+                <w:color w:val="1B2630"/>
+                <w:sz w:val="15"/>
+              </w:rPr>
+              <w:t xml:space="preserve"> · online · podologen en artsen</w:t>
+            </w:r>
+          </w:p>
         </w:tc>
         <w:tc>
           <w:tcPr>
             <w:tcW w:type="dxa" w:w="2835"/>
+            <w:shd w:val="clear" w:color="auto" w:fill="DDF1F8"/>
           </w:tcPr>
           <w:p>
             <w:pPr>
@@ -1787,6 +1752,41 @@
                 <w:sz w:val="15"/>
               </w:rPr>
               <w:t>9</w:t>
+            </w:r>
+          </w:p>
+          <w:p>
+            <w:pPr>
+              <w:spacing w:before="20" w:after="20"/>
+            </w:pPr>
+            <w:r>
+              <w:rPr>
+                <w:rFonts w:ascii="Segoe UI" w:hAnsi="Segoe UI"/>
+                <w:b/>
+                <w:i w:val="0"/>
+                <w:color w:val="00407A"/>
+                <w:sz w:val="15"/>
+              </w:rPr>
+              <w:t xml:space="preserve">VM  </w:t>
+            </w:r>
+            <w:r>
+              <w:rPr>
+                <w:rFonts w:ascii="Segoe UI" w:hAnsi="Segoe UI"/>
+                <w:b/>
+                <w:i w:val="0"/>
+                <w:color w:val="00407A"/>
+                <w:sz w:val="15"/>
+              </w:rPr>
+              <w:t>Technologie</w:t>
+            </w:r>
+            <w:r>
+              <w:rPr>
+                <w:rFonts w:ascii="Segoe UI" w:hAnsi="Segoe UI"/>
+                <w:b w:val="0"/>
+                <w:i w:val="0"/>
+                <w:color w:val="1B2630"/>
+                <w:sz w:val="15"/>
+              </w:rPr>
+              <w:t xml:space="preserve"> · UZ Antwerpen</w:t>
             </w:r>
           </w:p>
         </w:tc>
@@ -2005,7 +2005,6 @@
         <w:tc>
           <w:tcPr>
             <w:tcW w:type="dxa" w:w="2835"/>
-            <w:shd w:val="clear" w:color="auto" w:fill="DDF1F8"/>
           </w:tcPr>
           <w:p>
             <w:pPr>
@@ -2022,45 +2021,11 @@
               <w:t>16</w:t>
             </w:r>
           </w:p>
-          <w:p>
-            <w:pPr>
-              <w:spacing w:before="20" w:after="20"/>
-            </w:pPr>
-            <w:r>
-              <w:rPr>
-                <w:rFonts w:ascii="Segoe UI" w:hAnsi="Segoe UI"/>
-                <w:b/>
-                <w:i w:val="0"/>
-                <w:color w:val="00407A"/>
-                <w:sz w:val="15"/>
-              </w:rPr>
-              <w:t xml:space="preserve">VM  </w:t>
-            </w:r>
-            <w:r>
-              <w:rPr>
-                <w:rFonts w:ascii="Segoe UI" w:hAnsi="Segoe UI"/>
-                <w:b/>
-                <w:i w:val="0"/>
-                <w:color w:val="00407A"/>
-                <w:sz w:val="15"/>
-              </w:rPr>
-              <w:t>Technologie</w:t>
-            </w:r>
-            <w:r>
-              <w:rPr>
-                <w:rFonts w:ascii="Segoe UI" w:hAnsi="Segoe UI"/>
-                <w:b w:val="0"/>
-                <w:i w:val="0"/>
-                <w:color w:val="1B2630"/>
-                <w:sz w:val="15"/>
-              </w:rPr>
-              <w:t xml:space="preserve"> · UZ Antwerpen</w:t>
-            </w:r>
-          </w:p>
         </w:tc>
         <w:tc>
           <w:tcPr>
             <w:tcW w:type="dxa" w:w="2835"/>
+            <w:shd w:val="clear" w:color="auto" w:fill="E3ECF5"/>
           </w:tcPr>
           <w:p>
             <w:pPr>
@@ -2075,6 +2040,41 @@
                 <w:sz w:val="15"/>
               </w:rPr>
               <w:t>17</w:t>
+            </w:r>
+          </w:p>
+          <w:p>
+            <w:pPr>
+              <w:spacing w:before="20" w:after="20"/>
+            </w:pPr>
+            <w:r>
+              <w:rPr>
+                <w:rFonts w:ascii="Segoe UI" w:hAnsi="Segoe UI"/>
+                <w:b/>
+                <w:i w:val="0"/>
+                <w:color w:val="00407A"/>
+                <w:sz w:val="15"/>
+              </w:rPr>
+              <w:t xml:space="preserve">8u30–10u  </w:t>
+            </w:r>
+            <w:r>
+              <w:rPr>
+                <w:rFonts w:ascii="Segoe UI" w:hAnsi="Segoe UI"/>
+                <w:b/>
+                <w:i w:val="0"/>
+                <w:color w:val="00407A"/>
+                <w:sz w:val="15"/>
+              </w:rPr>
+              <w:t>Herhaling gezondheidseconomie en procesevaluatie (optie B)</w:t>
+            </w:r>
+            <w:r>
+              <w:rPr>
+                <w:rFonts w:ascii="Segoe UI" w:hAnsi="Segoe UI"/>
+                <w:b w:val="0"/>
+                <w:i w:val="0"/>
+                <w:color w:val="1B2630"/>
+                <w:sz w:val="15"/>
+              </w:rPr>
+              <w:t xml:space="preserve"> · online</w:t>
             </w:r>
           </w:p>
         </w:tc>
@@ -2110,7 +2110,7 @@
                 <w:color w:val="1B2630"/>
                 <w:sz w:val="15"/>
               </w:rPr>
-              <w:t>Feedbackblad naar de centra; materiaal SEBIA 1–2 klaar</w:t>
+              <w:t>Vragenlijstenset en feedbackblad naar de centra; materiaal SEBIA 1–2 klaar</w:t>
             </w:r>
             <w:r>
               <w:rPr>
@@ -2120,7 +2120,7 @@
                 <w:color w:val="1B2630"/>
                 <w:sz w:val="15"/>
               </w:rPr>
-              <w:t xml:space="preserve"> · studieteam</w:t>
+              <w:t xml:space="preserve"> · Janou</w:t>
             </w:r>
           </w:p>
         </w:tc>
@@ -2807,7 +2807,7 @@
         <w:tc>
           <w:tcPr>
             <w:tcW w:type="dxa" w:w="2835"/>
-            <w:shd w:val="clear" w:color="auto" w:fill="FFE9D6"/>
+            <w:shd w:val="clear" w:color="auto" w:fill="FFFFFF"/>
           </w:tcPr>
           <w:p>
             <w:pPr>
@@ -2837,41 +2837,6 @@
                 <w:sz w:val="15"/>
               </w:rPr>
               <w:t>Vragenlijstenset als proefpatiënt · eigen centrum</w:t>
-            </w:r>
-          </w:p>
-          <w:p>
-            <w:pPr>
-              <w:spacing w:before="20" w:after="20"/>
-            </w:pPr>
-            <w:r>
-              <w:rPr>
-                <w:rFonts w:ascii="Segoe UI" w:hAnsi="Segoe UI"/>
-                <w:b/>
-                <w:i w:val="0"/>
-                <w:color w:val="A34A00"/>
-                <w:sz w:val="15"/>
-              </w:rPr>
-              <w:t xml:space="preserve">9u–13u  </w:t>
-            </w:r>
-            <w:r>
-              <w:rPr>
-                <w:rFonts w:ascii="Segoe UI" w:hAnsi="Segoe UI"/>
-                <w:b/>
-                <w:i w:val="0"/>
-                <w:color w:val="A34A00"/>
-                <w:sz w:val="15"/>
-              </w:rPr>
-              <w:t>SEBIA 1–2, groep Oost</w:t>
-            </w:r>
-            <w:r>
-              <w:rPr>
-                <w:rFonts w:ascii="Segoe UI" w:hAnsi="Segoe UI"/>
-                <w:b w:val="0"/>
-                <w:i w:val="0"/>
-                <w:color w:val="1B2630"/>
-                <w:sz w:val="15"/>
-              </w:rPr>
-              <w:t xml:space="preserve"> · centraal, voorstel Leuven</w:t>
             </w:r>
           </w:p>
         </w:tc>
@@ -3074,7 +3039,7 @@
                 <w:color w:val="1B2630"/>
                 <w:sz w:val="15"/>
               </w:rPr>
-              <w:t xml:space="preserve"> · studieteam</w:t>
+              <w:t xml:space="preserve"> · Janou</w:t>
             </w:r>
           </w:p>
         </w:tc>
@@ -3176,6 +3141,41 @@
                 <w:sz w:val="15"/>
               </w:rPr>
               <w:t xml:space="preserve"> · online</w:t>
+            </w:r>
+          </w:p>
+          <w:p>
+            <w:pPr>
+              <w:spacing w:before="20" w:after="20"/>
+            </w:pPr>
+            <w:r>
+              <w:rPr>
+                <w:rFonts w:ascii="Segoe UI" w:hAnsi="Segoe UI"/>
+                <w:b/>
+                <w:i w:val="0"/>
+                <w:color w:val="A34A00"/>
+                <w:sz w:val="15"/>
+              </w:rPr>
+              <w:t xml:space="preserve">13u–17u  </w:t>
+            </w:r>
+            <w:r>
+              <w:rPr>
+                <w:rFonts w:ascii="Segoe UI" w:hAnsi="Segoe UI"/>
+                <w:b/>
+                <w:i w:val="0"/>
+                <w:color w:val="A34A00"/>
+                <w:sz w:val="15"/>
+              </w:rPr>
+              <w:t>SEBIA 1–2, groep Oost</w:t>
+            </w:r>
+            <w:r>
+              <w:rPr>
+                <w:rFonts w:ascii="Segoe UI" w:hAnsi="Segoe UI"/>
+                <w:b w:val="0"/>
+                <w:i w:val="0"/>
+                <w:color w:val="1B2630"/>
+                <w:sz w:val="15"/>
+              </w:rPr>
+              <w:t xml:space="preserve"> · centraal, voorstel Leuven</w:t>
             </w:r>
           </w:p>
         </w:tc>
@@ -5038,7 +5038,6 @@
         <w:tc>
           <w:tcPr>
             <w:tcW w:type="dxa" w:w="2835"/>
-            <w:shd w:val="clear" w:color="auto" w:fill="FFE9D6"/>
           </w:tcPr>
           <w:p>
             <w:pPr>
@@ -5053,41 +5052,6 @@
                 <w:sz w:val="15"/>
               </w:rPr>
               <w:t>2</w:t>
-            </w:r>
-          </w:p>
-          <w:p>
-            <w:pPr>
-              <w:spacing w:before="20" w:after="20"/>
-            </w:pPr>
-            <w:r>
-              <w:rPr>
-                <w:rFonts w:ascii="Segoe UI" w:hAnsi="Segoe UI"/>
-                <w:b/>
-                <w:i w:val="0"/>
-                <w:color w:val="A34A00"/>
-                <w:sz w:val="15"/>
-              </w:rPr>
-              <w:t xml:space="preserve">9u–13u  </w:t>
-            </w:r>
-            <w:r>
-              <w:rPr>
-                <w:rFonts w:ascii="Segoe UI" w:hAnsi="Segoe UI"/>
-                <w:b/>
-                <w:i w:val="0"/>
-                <w:color w:val="A34A00"/>
-                <w:sz w:val="15"/>
-              </w:rPr>
-              <w:t>SEBIA 3–4, groep Oost (optie A)</w:t>
-            </w:r>
-            <w:r>
-              <w:rPr>
-                <w:rFonts w:ascii="Segoe UI" w:hAnsi="Segoe UI"/>
-                <w:b w:val="0"/>
-                <w:i w:val="0"/>
-                <w:color w:val="1B2630"/>
-                <w:sz w:val="15"/>
-              </w:rPr>
-              <w:t xml:space="preserve"> · centraal, voorstel Leuven</w:t>
             </w:r>
           </w:p>
         </w:tc>
@@ -5310,7 +5274,7 @@
                 <w:color w:val="A34A00"/>
                 <w:sz w:val="15"/>
               </w:rPr>
-              <w:t>SEBIA 3–4, groep Oost (optie B)</w:t>
+              <w:t>SEBIA 3–4, groep Oost (optie A)</w:t>
             </w:r>
             <w:r>
               <w:rPr>
@@ -5557,6 +5521,7 @@
         <w:tc>
           <w:tcPr>
             <w:tcW w:type="dxa" w:w="2835"/>
+            <w:shd w:val="clear" w:color="auto" w:fill="FFE9D6"/>
           </w:tcPr>
           <w:p>
             <w:pPr>
@@ -5571,6 +5536,41 @@
                 <w:sz w:val="15"/>
               </w:rPr>
               <w:t>23</w:t>
+            </w:r>
+          </w:p>
+          <w:p>
+            <w:pPr>
+              <w:spacing w:before="20" w:after="20"/>
+            </w:pPr>
+            <w:r>
+              <w:rPr>
+                <w:rFonts w:ascii="Segoe UI" w:hAnsi="Segoe UI"/>
+                <w:b/>
+                <w:i w:val="0"/>
+                <w:color w:val="A34A00"/>
+                <w:sz w:val="15"/>
+              </w:rPr>
+              <w:t xml:space="preserve">9u–13u  </w:t>
+            </w:r>
+            <w:r>
+              <w:rPr>
+                <w:rFonts w:ascii="Segoe UI" w:hAnsi="Segoe UI"/>
+                <w:b/>
+                <w:i w:val="0"/>
+                <w:color w:val="A34A00"/>
+                <w:sz w:val="15"/>
+              </w:rPr>
+              <w:t>SEBIA 3–4, groep Oost (optie B)</w:t>
+            </w:r>
+            <w:r>
+              <w:rPr>
+                <w:rFonts w:ascii="Segoe UI" w:hAnsi="Segoe UI"/>
+                <w:b w:val="0"/>
+                <w:i w:val="0"/>
+                <w:color w:val="1B2630"/>
+                <w:sz w:val="15"/>
+              </w:rPr>
+              <w:t xml:space="preserve"> · centraal, voorstel Leuven</w:t>
             </w:r>
           </w:p>
         </w:tc>
@@ -5796,7 +5796,7 @@
           <w:color w:val="1B2630"/>
           <w:sz w:val="17"/>
         </w:rPr>
-        <w:t>SEBIA 5, 1,5 u per podoloog in het eigen centrum, in maart vóór de paasvakantie (A) of vanaf 12 april (B), vóór de eerste maand 3-visite (beste moment: Kortrijk wo, Brugge ma VM, Gent do VM, Leuven di, Antwerpen di of wo VM, Aalst di). SEBIA 6, intervisie, 1 u per podoloog, online, op maand 6–9 na de start van de inclusies.</w:t>
+        <w:t>SEBIA 5, 1,5 u per podoloog in het eigen centrum, door Dobbels, in maart vóór de paasvakantie (A) of vanaf 12 april (B), vóór de eerste maand 3-visite (beste moment: Kortrijk wo, Brugge ma VM, Antwerpen di of wo VM in een even week, Aalst di; Gent en Leuven nog op te vragen). SEBIA 6, intervisie, 1 u per podoloog, online, op maand 6–9 na de start van de inclusies.</w:t>
       </w:r>
     </w:p>
     <w:p>
@@ -5842,7 +5842,7 @@
           <w:color w:val="5A6A78"/>
           <w:sz w:val="17"/>
         </w:rPr>
-        <w:t>Technologie en droogloop ter plaatse; SEBIA 1–4 centraal. De online sessies staan in de maandrasters.</w:t>
+        <w:t>Technologie en droogloop ter plaatse; SEBIA 1–4 centraal. De online sessies staan in de maandrasters. De twee pedorthisten komen elk naar één technologiesessie, bij een van hun centra.</w:t>
       </w:r>
     </w:p>
     <w:tbl>
@@ -6509,7 +6509,7 @@
                 <w:color w:val="1B2630"/>
                 <w:sz w:val="16"/>
               </w:rPr>
-              <w:t>donderdag VM</w:t>
+              <w:t>nog op te vragen</w:t>
             </w:r>
           </w:p>
         </w:tc>
@@ -6594,7 +6594,7 @@
                 <w:color w:val="1B2630"/>
                 <w:sz w:val="16"/>
               </w:rPr>
-              <w:t>Oost: di 5 jan, 9u–13u</w:t>
+              <w:t>Oost: di 12 jan, 13u–17u</w:t>
             </w:r>
           </w:p>
         </w:tc>
@@ -6654,7 +6654,7 @@
                 <w:color w:val="1B2630"/>
                 <w:sz w:val="16"/>
               </w:rPr>
-              <w:t>Oost · A: di 2 mrt · B: di 9 mrt</w:t>
+              <w:t>Oost · A: di 9 mrt · B: di 23 mrt</w:t>
             </w:r>
           </w:p>
         </w:tc>
@@ -6759,7 +6759,7 @@
                 <w:color w:val="1B2630"/>
                 <w:sz w:val="16"/>
               </w:rPr>
-              <w:t>Oost: di 5 jan, 9u–13u</w:t>
+              <w:t>Oost: di 12 jan, 13u–17u</w:t>
             </w:r>
           </w:p>
         </w:tc>
@@ -6819,7 +6819,7 @@
                 <w:color w:val="1B2630"/>
                 <w:sz w:val="16"/>
               </w:rPr>
-              <w:t>Oost · A: di 2 mrt · B: di 9 mrt</w:t>
+              <w:t>Oost · A: di 9 mrt · B: di 23 mrt</w:t>
             </w:r>
           </w:p>
         </w:tc>
@@ -6839,7 +6839,7 @@
                 <w:color w:val="1B2630"/>
                 <w:sz w:val="16"/>
               </w:rPr>
-              <w:t>dinsdag</w:t>
+              <w:t>nog op te vragen</w:t>
             </w:r>
           </w:p>
         </w:tc>
@@ -6904,7 +6904,7 @@
                 <w:color w:val="1B2630"/>
                 <w:sz w:val="16"/>
               </w:rPr>
-              <w:t>wo 16 dec, VM</w:t>
+              <w:t>wo 9 dec, VM</w:t>
             </w:r>
           </w:p>
         </w:tc>
@@ -6924,7 +6924,7 @@
                 <w:color w:val="1B2630"/>
                 <w:sz w:val="16"/>
               </w:rPr>
-              <w:t>Oost: di 5 jan, 9u–13u</w:t>
+              <w:t>Oost: di 12 jan, 13u–17u</w:t>
             </w:r>
           </w:p>
         </w:tc>
@@ -6984,7 +6984,7 @@
                 <w:color w:val="1B2630"/>
                 <w:sz w:val="16"/>
               </w:rPr>
-              <w:t>Oost · A: di 2 mrt · B: di 9 mrt</w:t>
+              <w:t>Oost · A: di 9 mrt · B: di 23 mrt</w:t>
             </w:r>
           </w:p>
         </w:tc>
@@ -7004,7 +7004,7 @@
                 <w:color w:val="1B2630"/>
                 <w:sz w:val="16"/>
               </w:rPr>
-              <w:t>di of wo VM</w:t>
+              <w:t>di of wo VM, even week</w:t>
             </w:r>
           </w:p>
         </w:tc>
@@ -7024,7 +7024,7 @@
                 <w:color w:val="1B2630"/>
                 <w:sz w:val="16"/>
               </w:rPr>
-              <w:t>di, wo, do (even weken) · voetkliniek wo NM en do NM</w:t>
+              <w:t>di, wo, do, alleen in even weken · voetkliniek wo NM en do NM</w:t>
             </w:r>
           </w:p>
         </w:tc>
@@ -7100,7 +7100,7 @@
           <w:color w:val="1B2630"/>
           <w:sz w:val="17"/>
         </w:rPr>
-        <w:t>Online sessies: A = opname voor wie niet kan · B = live herhaling op do 12, 19 en 26 nov, 8u30–10u.</w:t>
+        <w:t>Online sessies: A = opname voor wie niet kan · B = live herhaling op do 12 nov, do 26 nov en do 17 dec, 8u30–10u.</w:t>
       </w:r>
     </w:p>
     <w:p>
@@ -7126,7 +7126,33 @@
           <w:color w:val="1B2630"/>
           <w:sz w:val="17"/>
         </w:rPr>
-        <w:t>Datacollectie: A = opname · B = herhaling vr 15 jan, 13u–15u, voor Gent.</w:t>
+        <w:t>Datacollectie: A = opname · B = herhaling vr 15 jan, 13u–15u, voor Gent. Brugge krijgt in beide gevallen de opname.</w:t>
+      </w:r>
+    </w:p>
+    <w:p>
+      <w:pPr>
+        <w:spacing w:before="0" w:after="20"/>
+        <w:ind w:left="200" w:hanging="200"/>
+      </w:pPr>
+      <w:r>
+        <w:rPr>
+          <w:rFonts w:ascii="Segoe UI" w:hAnsi="Segoe UI"/>
+          <w:b/>
+          <w:i w:val="0"/>
+          <w:color w:val="FF7A00"/>
+          <w:sz w:val="17"/>
+        </w:rPr>
+        <w:t xml:space="preserve">–  </w:t>
+      </w:r>
+      <w:r>
+        <w:rPr>
+          <w:rFonts w:ascii="Segoe UI" w:hAnsi="Segoe UI"/>
+          <w:b w:val="0"/>
+          <w:i w:val="0"/>
+          <w:color w:val="1B2630"/>
+          <w:sz w:val="17"/>
+        </w:rPr>
+        <w:t>Bij welke technologiesessie elk van de twee pedorthisten aanwezig is.</w:t>
       </w:r>
     </w:p>
     <w:p>

</xml_diff>

<commit_message>
Opleidingsplanning klaar om af te kloppen: technologie eerst theorie, laatste fouten recht
Janou geeft de theorie, ook van technologie en datacollectie; artsen kunnen bij het theoriedeel van de technologie aansluiten, de twee pedorthisten komen er elk een keer; SEBIA 5 door Dobbels in de centra, SEBIA 6 intervisie met feedback. Rechtgezet: Brugge heeft buiten de voetkliniek ook de tweede podoloog op dinsdagnamiddag, arts in plaats van arts en management, geen onbewezen unanimiteit of pilootregel, uitval twee weken kan alle zes drooglopen raken, verschil op maand 3 met het manuscript, folders bij de SEBIA-stappen.

Co-Authored-By: Claude Opus 5.5 <noreply@anthropic.com>
</commit_message>
<xml_diff>
--- a/PARADISE_kalender_opleiding.docx
+++ b/PARADISE_kalender_opleiding.docx
@@ -44,7 +44,7 @@
           <w:color w:val="5A6A78"/>
           <w:sz w:val="17"/>
         </w:rPr>
-        <w:t>November 2026 tot maart 2027, volgens de opleidingsplanning van 29 september 2026. VM = voormiddag, NM = namiddag. Waar het niet voor iedereen lukt, staan twee opties (A en B); die worden getoetst bij de centra tegen vr 16 okt. Artsen volgen alleen de theorie; technologie en droogloop zijn voor de podologen.</w:t>
+        <w:t>November 2026 tot maart 2027, volgens de opleidingsplanning van 29 september 2026. VM = voormiddag, NM = namiddag. Waar het niet voor iedereen lukt, staan twee opties (A en B); die worden getoetst bij de centra tegen vr 16 okt. Artsen volgen alleen theorie en kunnen aansluiten bij het theoriedeel van de technologie; de praktijk en de droogloop zijn voor de podologen.</w:t>
       </w:r>
     </w:p>
     <w:tbl>
@@ -5796,7 +5796,7 @@
           <w:color w:val="1B2630"/>
           <w:sz w:val="17"/>
         </w:rPr>
-        <w:t>SEBIA 5, 1,5 u per podoloog in het eigen centrum, door Dobbels, in maart vóór de paasvakantie (A) of vanaf 12 april (B), vóór de eerste maand 3-visite (beste moment: Kortrijk wo, Brugge ma VM, Antwerpen di of wo VM in een even week, Aalst di; Gent en Leuven nog op te vragen). SEBIA 6, intervisie, 1 u per podoloog, online, op maand 6–9 na de start van de inclusies.</w:t>
+        <w:t>SEBIA 5, 1,5 u per podoloog in het eigen centrum, door Dobbels, in maart vóór de paasvakantie (A) of vanaf 12 april (B), bij voorkeur vóór de eerste maand 3-visite (beste moment: Kortrijk wo, Brugge ma VM, Antwerpen di of wo VM in een even week, Aalst di; Gent en Leuven nog op te vragen). SEBIA 6, intervisie met feedback, 1 u per podoloog, online, door Dobbels, op maand 6–9 na de start van de inclusies.</w:t>
       </w:r>
     </w:p>
     <w:p>
@@ -5842,7 +5842,7 @@
           <w:color w:val="5A6A78"/>
           <w:sz w:val="17"/>
         </w:rPr>
-        <w:t>Technologie en droogloop ter plaatse; SEBIA 1–4 centraal. De online sessies staan in de maandrasters. De twee pedorthisten komen elk naar één technologiesessie, bij een van hun centra.</w:t>
+        <w:t>Technologie en droogloop ter plaatse; SEBIA 1–4 centraal. De online sessies staan in de maandrasters. De technologie begint met theorie, waar de artsen kunnen aansluiten en de twee pedorthisten elk één keer komen, bij een van hun centra.</w:t>
       </w:r>
     </w:p>
     <w:tbl>

</xml_diff>

<commit_message>
Online sessies worden opgenomen: geen opties of herhalingen meer
Wie niet live kan, bekijkt de opname online. Weg: de live herhalingen van 12 en 26 november, 17 december en 15 januari, de twee optierijen in sectie 9 en de vragen daarover op het toetsingsblad.

Co-Authored-By: Claude Opus 5.5 <noreply@anthropic.com>
</commit_message>
<xml_diff>
--- a/PARADISE_kalender_opleiding.docx
+++ b/PARADISE_kalender_opleiding.docx
@@ -674,7 +674,7 @@
                 <w:color w:val="1B2630"/>
                 <w:sz w:val="15"/>
               </w:rPr>
-              <w:t xml:space="preserve"> · online · podologen en artsen</w:t>
+              <w:t xml:space="preserve"> · online, opgenomen · podologen en artsen</w:t>
             </w:r>
           </w:p>
         </w:tc>
@@ -712,7 +712,6 @@
         <w:tc>
           <w:tcPr>
             <w:tcW w:type="dxa" w:w="2835"/>
-            <w:shd w:val="clear" w:color="auto" w:fill="E3ECF5"/>
           </w:tcPr>
           <w:p>
             <w:pPr>
@@ -727,41 +726,6 @@
                 <w:sz w:val="15"/>
               </w:rPr>
               <w:t>12</w:t>
-            </w:r>
-          </w:p>
-          <w:p>
-            <w:pPr>
-              <w:spacing w:before="20" w:after="20"/>
-            </w:pPr>
-            <w:r>
-              <w:rPr>
-                <w:rFonts w:ascii="Segoe UI" w:hAnsi="Segoe UI"/>
-                <w:b/>
-                <w:i w:val="0"/>
-                <w:color w:val="00407A"/>
-                <w:sz w:val="15"/>
-              </w:rPr>
-              <w:t xml:space="preserve">8u30–10u  </w:t>
-            </w:r>
-            <w:r>
-              <w:rPr>
-                <w:rFonts w:ascii="Segoe UI" w:hAnsi="Segoe UI"/>
-                <w:b/>
-                <w:i w:val="0"/>
-                <w:color w:val="00407A"/>
-                <w:sz w:val="15"/>
-              </w:rPr>
-              <w:t>Herhaling theorie 1 (optie B)</w:t>
-            </w:r>
-            <w:r>
-              <w:rPr>
-                <w:rFonts w:ascii="Segoe UI" w:hAnsi="Segoe UI"/>
-                <w:b w:val="0"/>
-                <w:i w:val="0"/>
-                <w:color w:val="1B2630"/>
-                <w:sz w:val="15"/>
-              </w:rPr>
-              <w:t xml:space="preserve"> · online</w:t>
             </w:r>
           </w:p>
         </w:tc>
@@ -1007,7 +971,7 @@
                 <w:color w:val="1B2630"/>
                 <w:sz w:val="15"/>
               </w:rPr>
-              <w:t xml:space="preserve"> · online · podologen en artsen</w:t>
+              <w:t xml:space="preserve"> · online, opgenomen · podologen en artsen</w:t>
             </w:r>
           </w:p>
         </w:tc>
@@ -1034,7 +998,6 @@
         <w:tc>
           <w:tcPr>
             <w:tcW w:type="dxa" w:w="2835"/>
-            <w:shd w:val="clear" w:color="auto" w:fill="E3ECF5"/>
           </w:tcPr>
           <w:p>
             <w:pPr>
@@ -1049,41 +1012,6 @@
                 <w:sz w:val="15"/>
               </w:rPr>
               <w:t>26</w:t>
-            </w:r>
-          </w:p>
-          <w:p>
-            <w:pPr>
-              <w:spacing w:before="20" w:after="20"/>
-            </w:pPr>
-            <w:r>
-              <w:rPr>
-                <w:rFonts w:ascii="Segoe UI" w:hAnsi="Segoe UI"/>
-                <w:b/>
-                <w:i w:val="0"/>
-                <w:color w:val="00407A"/>
-                <w:sz w:val="15"/>
-              </w:rPr>
-              <w:t xml:space="preserve">8u30–10u  </w:t>
-            </w:r>
-            <w:r>
-              <w:rPr>
-                <w:rFonts w:ascii="Segoe UI" w:hAnsi="Segoe UI"/>
-                <w:b/>
-                <w:i w:val="0"/>
-                <w:color w:val="00407A"/>
-                <w:sz w:val="15"/>
-              </w:rPr>
-              <w:t>Herhaling theorie 2 (optie B)</w:t>
-            </w:r>
-            <w:r>
-              <w:rPr>
-                <w:rFonts w:ascii="Segoe UI" w:hAnsi="Segoe UI"/>
-                <w:b w:val="0"/>
-                <w:i w:val="0"/>
-                <w:color w:val="1B2630"/>
-                <w:sz w:val="15"/>
-              </w:rPr>
-              <w:t xml:space="preserve"> · online</w:t>
             </w:r>
           </w:p>
         </w:tc>
@@ -1730,7 +1658,7 @@
                 <w:color w:val="1B2630"/>
                 <w:sz w:val="15"/>
               </w:rPr>
-              <w:t xml:space="preserve"> · online · podologen en artsen</w:t>
+              <w:t xml:space="preserve"> · online, opgenomen · podologen en artsen</w:t>
             </w:r>
           </w:p>
         </w:tc>
@@ -2025,7 +1953,6 @@
         <w:tc>
           <w:tcPr>
             <w:tcW w:type="dxa" w:w="2835"/>
-            <w:shd w:val="clear" w:color="auto" w:fill="E3ECF5"/>
           </w:tcPr>
           <w:p>
             <w:pPr>
@@ -2040,41 +1967,6 @@
                 <w:sz w:val="15"/>
               </w:rPr>
               <w:t>17</w:t>
-            </w:r>
-          </w:p>
-          <w:p>
-            <w:pPr>
-              <w:spacing w:before="20" w:after="20"/>
-            </w:pPr>
-            <w:r>
-              <w:rPr>
-                <w:rFonts w:ascii="Segoe UI" w:hAnsi="Segoe UI"/>
-                <w:b/>
-                <w:i w:val="0"/>
-                <w:color w:val="00407A"/>
-                <w:sz w:val="15"/>
-              </w:rPr>
-              <w:t xml:space="preserve">8u30–10u  </w:t>
-            </w:r>
-            <w:r>
-              <w:rPr>
-                <w:rFonts w:ascii="Segoe UI" w:hAnsi="Segoe UI"/>
-                <w:b/>
-                <w:i w:val="0"/>
-                <w:color w:val="00407A"/>
-                <w:sz w:val="15"/>
-              </w:rPr>
-              <w:t>Herhaling gezondheidseconomie en procesevaluatie (optie B)</w:t>
-            </w:r>
-            <w:r>
-              <w:rPr>
-                <w:rFonts w:ascii="Segoe UI" w:hAnsi="Segoe UI"/>
-                <w:b w:val="0"/>
-                <w:i w:val="0"/>
-                <w:color w:val="1B2630"/>
-                <w:sz w:val="15"/>
-              </w:rPr>
-              <w:t xml:space="preserve"> · online</w:t>
             </w:r>
           </w:p>
         </w:tc>
@@ -3140,7 +3032,7 @@
                 <w:color w:val="1B2630"/>
                 <w:sz w:val="15"/>
               </w:rPr>
-              <w:t xml:space="preserve"> · online</w:t>
+              <w:t xml:space="preserve"> · online, opgenomen · podologen</w:t>
             </w:r>
           </w:p>
           <w:p>
@@ -3294,7 +3186,6 @@
         <w:tc>
           <w:tcPr>
             <w:tcW w:type="dxa" w:w="2835"/>
-            <w:shd w:val="clear" w:color="auto" w:fill="E3ECF5"/>
           </w:tcPr>
           <w:p>
             <w:pPr>
@@ -3309,41 +3200,6 @@
                 <w:sz w:val="15"/>
               </w:rPr>
               <w:t>15</w:t>
-            </w:r>
-          </w:p>
-          <w:p>
-            <w:pPr>
-              <w:spacing w:before="20" w:after="20"/>
-            </w:pPr>
-            <w:r>
-              <w:rPr>
-                <w:rFonts w:ascii="Segoe UI" w:hAnsi="Segoe UI"/>
-                <w:b/>
-                <w:i w:val="0"/>
-                <w:color w:val="00407A"/>
-                <w:sz w:val="15"/>
-              </w:rPr>
-              <w:t xml:space="preserve">13u–15u  </w:t>
-            </w:r>
-            <w:r>
-              <w:rPr>
-                <w:rFonts w:ascii="Segoe UI" w:hAnsi="Segoe UI"/>
-                <w:b/>
-                <w:i w:val="0"/>
-                <w:color w:val="00407A"/>
-                <w:sz w:val="15"/>
-              </w:rPr>
-              <w:t>Herhaling datacollectie (optie B)</w:t>
-            </w:r>
-            <w:r>
-              <w:rPr>
-                <w:rFonts w:ascii="Segoe UI" w:hAnsi="Segoe UI"/>
-                <w:b w:val="0"/>
-                <w:i w:val="0"/>
-                <w:color w:val="1B2630"/>
-                <w:sz w:val="15"/>
-              </w:rPr>
-              <w:t xml:space="preserve"> · online, voor Gent</w:t>
             </w:r>
           </w:p>
         </w:tc>
@@ -7100,33 +6956,7 @@
           <w:color w:val="1B2630"/>
           <w:sz w:val="17"/>
         </w:rPr>
-        <w:t>Online sessies: A = opname voor wie niet kan · B = live herhaling op do 12 nov, do 26 nov en do 17 dec, 8u30–10u.</w:t>
-      </w:r>
-    </w:p>
-    <w:p>
-      <w:pPr>
-        <w:spacing w:before="0" w:after="20"/>
-        <w:ind w:left="200" w:hanging="200"/>
-      </w:pPr>
-      <w:r>
-        <w:rPr>
-          <w:rFonts w:ascii="Segoe UI" w:hAnsi="Segoe UI"/>
-          <w:b/>
-          <w:i w:val="0"/>
-          <w:color w:val="FF7A00"/>
-          <w:sz w:val="17"/>
-        </w:rPr>
-        <w:t xml:space="preserve">–  </w:t>
-      </w:r>
-      <w:r>
-        <w:rPr>
-          <w:rFonts w:ascii="Segoe UI" w:hAnsi="Segoe UI"/>
-          <w:b w:val="0"/>
-          <w:i w:val="0"/>
-          <w:color w:val="1B2630"/>
-          <w:sz w:val="17"/>
-        </w:rPr>
-        <w:t>Datacollectie: A = opname · B = herhaling vr 15 jan, 13u–15u, voor Gent. Brugge krijgt in beide gevallen de opname.</w:t>
+        <w:t>Online sessies worden opgenomen. Wie niet live kan, bekijkt de opname online.</w:t>
       </w:r>
     </w:p>
     <w:p>

</xml_diff>

<commit_message>
Praktijksessies worden niet opgenomen; opnames van de procesevaluatie verduidelijkt
Opgenomen worden alleen de online sessies: theorie 1 en 2, gezondheidseconomie en procesevaluatie, en datacollectie. Technologie, SEBIA 1 tot 5 en de droogloop, ter plaatse of centraal, worden niet opgenomen; aanwezigheid is nodig. De opnames en observaties van de procesevaluatie gaan over PARADISE-sessies met patiënten.

Co-Authored-By: Claude Opus 5.5 <noreply@anthropic.com>
</commit_message>
<xml_diff>
--- a/PARADISE_kalender_opleiding.docx
+++ b/PARADISE_kalender_opleiding.docx
@@ -6956,7 +6956,33 @@
           <w:color w:val="1B2630"/>
           <w:sz w:val="17"/>
         </w:rPr>
-        <w:t>Online sessies worden opgenomen. Wie niet live kan, bekijkt de opname online.</w:t>
+        <w:t>Opgenomen worden de online sessies: theorie 1 en 2, gezondheidseconomie en procesevaluatie, en datacollectie. Wie niet live kan, bekijkt de opname online.</w:t>
+      </w:r>
+    </w:p>
+    <w:p>
+      <w:pPr>
+        <w:spacing w:before="0" w:after="20"/>
+        <w:ind w:left="200" w:hanging="200"/>
+      </w:pPr>
+      <w:r>
+        <w:rPr>
+          <w:rFonts w:ascii="Segoe UI" w:hAnsi="Segoe UI"/>
+          <w:b/>
+          <w:i w:val="0"/>
+          <w:color w:val="FF7A00"/>
+          <w:sz w:val="17"/>
+        </w:rPr>
+        <w:t xml:space="preserve">–  </w:t>
+      </w:r>
+      <w:r>
+        <w:rPr>
+          <w:rFonts w:ascii="Segoe UI" w:hAnsi="Segoe UI"/>
+          <w:b w:val="0"/>
+          <w:i w:val="0"/>
+          <w:color w:val="1B2630"/>
+          <w:sz w:val="17"/>
+        </w:rPr>
+        <w:t>Niet opgenomen worden de praktijksessies, ter plaatse en op een centrale locatie: technologie, SEBIA 1 tot 5 en de droogloop. Daar is aanwezigheid nodig.</w:t>
       </w:r>
     </w:p>
     <w:p>

</xml_diff>